<commit_message>
Fix unaccented author and supervisor names in paper and slides
</commit_message>
<xml_diff>
--- a/paper/EduGuard_Paper.docx
+++ b/paper/EduGuard_Paper.docx
@@ -211,27 +211,11 @@
         <w:pStyle w:val="FirstParagraph"/>
       </w:pPr>
       <w:r>
-        <w:rPr>
-          <w:b/>
-          <w:bCs/>
-        </w:rPr>
-        <w:t xml:space="preserve">Tran Bao Phuc, Pham Minh Duc, Phan Vinh Khoa, Nguyen Thanh Binh, Nguyen Vu An, and La Quang Thien Son</w:t>
-      </w:r>
-      <w:r>
+        <w:t>Le Thanh Vinh, Bui Van Son, Tran Ngoc Sang, and Le Huy Anh</w:t>
         <w:br/>
-      </w:r>
-      <w:r>
-        <w:t xml:space="preserve">FPT University, Hanoi, Vietnam</w:t>
-      </w:r>
-      <w:r>
+        <w:t>FPT University, Hanoi, Vietnam</w:t>
         <w:br/>
-      </w:r>
-      <w:r>
-        <w:rPr>
-          <w:i/>
-          <w:iCs/>
-        </w:rPr>
-        <w:t xml:space="preserve">DSP391m Data Science capstone project, supervised by Nguyen Thi Hoang Yen.</w:t>
+        <w:t>DSP391m Data Science capstone project, supervised by Phan Duy Hung.</w:t>
       </w:r>
     </w:p>
     <w:p>
@@ -12164,25 +12148,7 @@
         <w:pStyle w:val="FirstParagraph"/>
       </w:pPr>
       <w:r>
-        <w:t xml:space="preserve">The authors thank their supervisor, Nguyen Thi Hoang Yen, and the Data</w:t>
-      </w:r>
-      <w:r>
-        <w:t xml:space="preserve"> </w:t>
-      </w:r>
-      <w:r>
-        <w:t xml:space="preserve">Science program at FPT University for guidance throughout this capstone</w:t>
-      </w:r>
-      <w:r>
-        <w:t xml:space="preserve"> </w:t>
-      </w:r>
-      <w:r>
-        <w:t xml:space="preserve">project. This study uses the Open University Learning Analytics Dataset</w:t>
-      </w:r>
-      <w:r>
-        <w:t xml:space="preserve"> </w:t>
-      </w:r>
-      <w:r>
-        <w:t xml:space="preserve">(OULAD), released under a CC-BY 4.0 licence.</w:t>
+        <w:t>The authors thank their supervisor, Phan Duy Hung, and the Data Science program at FPT University for guidance throughout this capstone project. This study uses the Open University Learning Analytics Dataset (OULAD), released under a CC-BY 4.0 licence.</w:t>
       </w:r>
     </w:p>
     <w:p>

</xml_diff>